<commit_message>
Hinzufügung der Dokus und der Ausarbeitung
</commit_message>
<xml_diff>
--- a/Diplomarbeit/doc/htl-da-doku-de-ab2025-it-christian-radlingmaier.docx
+++ b/Diplomarbeit/doc/htl-da-doku-de-ab2025-it-christian-radlingmaier.docx
@@ -1,6 +1,6 @@
 
 <file path=word/document.xml><?xml version="1.0" encoding="utf-8"?>
-<w:document xmlns:wpc="http://schemas.microsoft.com/office/word/2010/wordprocessingCanvas" xmlns:cx="http://schemas.microsoft.com/office/drawing/2014/chartex" xmlns:cx1="http://schemas.microsoft.com/office/drawing/2015/9/8/chartex" xmlns:cx2="http://schemas.microsoft.com/office/drawing/2015/10/21/chartex" xmlns:cx3="http://schemas.microsoft.com/office/drawing/2016/5/9/chartex" xmlns:cx4="http://schemas.microsoft.com/office/drawing/2016/5/10/chartex" xmlns:cx5="http://schemas.microsoft.com/office/drawing/2016/5/11/chartex" xmlns:cx6="http://schemas.microsoft.com/office/drawing/2016/5/12/chartex" xmlns:cx7="http://schemas.microsoft.com/office/drawing/2016/5/13/chartex" xmlns:cx8="http://schemas.microsoft.com/office/drawing/2016/5/14/chartex" xmlns:mc="http://schemas.openxmlformats.org/markup-compatibility/2006" xmlns:aink="http://schemas.microsoft.com/office/drawing/2016/ink" xmlns:am3d="http://schemas.microsoft.com/office/drawing/2017/model3d" xmlns:o="urn:schemas-microsoft-com:office:office" xmlns:r="http://schemas.openxmlformats.org/officeDocument/2006/relationships" xmlns:m="http://schemas.openxmlformats.org/officeDocument/2006/math" xmlns:v="urn:schemas-microsoft-com:vml" xmlns:wp14="http://schemas.microsoft.com/office/word/2010/wordprocessingDrawing" xmlns:wp="http://schemas.openxmlformats.org/drawingml/2006/wordprocessingDrawing" xmlns:w10="urn:schemas-microsoft-com:office:word" xmlns:w="http://schemas.openxmlformats.org/wordprocessingml/2006/main" xmlns:w14="http://schemas.microsoft.com/office/word/2010/wordml" xmlns:w15="http://schemas.microsoft.com/office/word/2012/wordml" xmlns:w16cid="http://schemas.microsoft.com/office/word/2016/wordml/cid" xmlns:w16se="http://schemas.microsoft.com/office/word/2015/wordml/symex" xmlns:wpg="http://schemas.microsoft.com/office/word/2010/wordprocessingGroup" xmlns:wpi="http://schemas.microsoft.com/office/word/2010/wordprocessingInk" xmlns:wne="http://schemas.microsoft.com/office/word/2006/wordml" xmlns:wps="http://schemas.microsoft.com/office/word/2010/wordprocessingShape" mc:Ignorable="w14 w15 w16se w16cid wp14">
+<w:document xmlns:wpc="http://schemas.microsoft.com/office/word/2010/wordprocessingCanvas" xmlns:cx="http://schemas.microsoft.com/office/drawing/2014/chartex" xmlns:cx1="http://schemas.microsoft.com/office/drawing/2015/9/8/chartex" xmlns:cx2="http://schemas.microsoft.com/office/drawing/2015/10/21/chartex" xmlns:cx3="http://schemas.microsoft.com/office/drawing/2016/5/9/chartex" xmlns:cx4="http://schemas.microsoft.com/office/drawing/2016/5/10/chartex" xmlns:cx5="http://schemas.microsoft.com/office/drawing/2016/5/11/chartex" xmlns:cx6="http://schemas.microsoft.com/office/drawing/2016/5/12/chartex" xmlns:cx7="http://schemas.microsoft.com/office/drawing/2016/5/13/chartex" xmlns:cx8="http://schemas.microsoft.com/office/drawing/2016/5/14/chartex" xmlns:mc="http://schemas.openxmlformats.org/markup-compatibility/2006" xmlns:aink="http://schemas.microsoft.com/office/drawing/2016/ink" xmlns:am3d="http://schemas.microsoft.com/office/drawing/2017/model3d" xmlns:o="urn:schemas-microsoft-com:office:office" xmlns:oel="http://schemas.microsoft.com/office/2019/extlst" xmlns:r="http://schemas.openxmlformats.org/officeDocument/2006/relationships" xmlns:m="http://schemas.openxmlformats.org/officeDocument/2006/math" xmlns:v="urn:schemas-microsoft-com:vml" xmlns:wp14="http://schemas.microsoft.com/office/word/2010/wordprocessingDrawing" xmlns:wp="http://schemas.openxmlformats.org/drawingml/2006/wordprocessingDrawing" xmlns:w10="urn:schemas-microsoft-com:office:word" xmlns:w="http://schemas.openxmlformats.org/wordprocessingml/2006/main" xmlns:w14="http://schemas.microsoft.com/office/word/2010/wordml" xmlns:w15="http://schemas.microsoft.com/office/word/2012/wordml" xmlns:w16cex="http://schemas.microsoft.com/office/word/2018/wordml/cex" xmlns:w16cid="http://schemas.microsoft.com/office/word/2016/wordml/cid" xmlns:w16="http://schemas.microsoft.com/office/word/2018/wordml" xmlns:w16du="http://schemas.microsoft.com/office/word/2023/wordml/word16du" xmlns:w16sdtdh="http://schemas.microsoft.com/office/word/2020/wordml/sdtdatahash" xmlns:w16sdtfl="http://schemas.microsoft.com/office/word/2024/wordml/sdtformatlock" xmlns:w16se="http://schemas.microsoft.com/office/word/2015/wordml/symex" xmlns:wpg="http://schemas.microsoft.com/office/word/2010/wordprocessingGroup" xmlns:wpi="http://schemas.microsoft.com/office/word/2010/wordprocessingInk" xmlns:wne="http://schemas.microsoft.com/office/word/2006/wordml" xmlns:wps="http://schemas.microsoft.com/office/word/2010/wordprocessingShape" mc:Ignorable="w14 w15 w16se w16cid w16 w16cex w16sdtdh w16sdtfl w16du wp14">
   <w:body>
     <w:p>
       <w:pPr>
@@ -137,10 +137,8 @@
                 <w:sz w:val="22"/>
                 <w:szCs w:val="22"/>
               </w:rPr>
-              <w:t>Name 1, Name 2</w:t>
-            </w:r>
-            <w:bookmarkStart w:id="0" w:name="_GoBack"/>
-            <w:bookmarkEnd w:id="0"/>
+              <w:t>Christian Radlingmaier</w:t>
+            </w:r>
           </w:p>
         </w:tc>
       </w:tr>
@@ -206,7 +204,23 @@
                 <w:sz w:val="22"/>
                 <w:szCs w:val="22"/>
               </w:rPr>
-              <w:t>5AH</w:t>
+              <w:t>5</w:t>
+            </w:r>
+            <w:r>
+              <w:rPr>
+                <w:rFonts w:ascii="Arial" w:hAnsi="Arial" w:cs="Arial"/>
+                <w:sz w:val="22"/>
+                <w:szCs w:val="22"/>
+              </w:rPr>
+              <w:t>B</w:t>
+            </w:r>
+            <w:r>
+              <w:rPr>
+                <w:rFonts w:ascii="Arial" w:hAnsi="Arial" w:cs="Arial"/>
+                <w:sz w:val="22"/>
+                <w:szCs w:val="22"/>
+              </w:rPr>
+              <w:t>H</w:t>
             </w:r>
             <w:r>
               <w:rPr>
@@ -246,7 +260,7 @@
                 <w:sz w:val="22"/>
                 <w:szCs w:val="22"/>
               </w:rPr>
-              <w:t>4</w:t>
+              <w:t>5</w:t>
             </w:r>
             <w:r>
               <w:rPr>
@@ -270,7 +284,7 @@
                 <w:sz w:val="22"/>
                 <w:szCs w:val="22"/>
               </w:rPr>
-              <w:t>5</w:t>
+              <w:t>6</w:t>
             </w:r>
           </w:p>
         </w:tc>
@@ -340,44 +354,13 @@
               </w:rPr>
             </w:pPr>
             <w:r>
-              <w:rPr>
-                <w:rFonts w:ascii="Arial" w:hAnsi="Arial" w:cs="Arial"/>
-                <w:sz w:val="22"/>
-                <w:szCs w:val="22"/>
-              </w:rPr>
-              <w:t>Entwurf ei</w:t>
-            </w:r>
-            <w:r>
-              <w:rPr>
-                <w:rFonts w:ascii="Arial" w:hAnsi="Arial" w:cs="Arial"/>
-                <w:sz w:val="22"/>
-                <w:szCs w:val="22"/>
-              </w:rPr>
-              <w:t>nes Versuchsstandes für Kreisel</w:t>
-            </w:r>
-            <w:r>
-              <w:rPr>
-                <w:rFonts w:ascii="Arial" w:hAnsi="Arial" w:cs="Arial"/>
-                <w:sz w:val="22"/>
-                <w:szCs w:val="22"/>
-              </w:rPr>
-              <w:t xml:space="preserve">pumpen, welcher in </w:t>
-            </w:r>
-            <w:r>
-              <w:rPr>
-                <w:rFonts w:ascii="Arial" w:hAnsi="Arial" w:cs="Arial"/>
-                <w:sz w:val="22"/>
-                <w:szCs w:val="22"/>
-              </w:rPr>
-              <w:t>ebener</w:t>
-            </w:r>
-            <w:r>
-              <w:rPr>
-                <w:rFonts w:ascii="Arial" w:hAnsi="Arial" w:cs="Arial"/>
-                <w:sz w:val="22"/>
-                <w:szCs w:val="22"/>
-              </w:rPr>
-              <w:t xml:space="preserve"> Ausführung verbaut wird</w:t>
+              <w:t xml:space="preserve">Konzeption und Umsetzung eines modularen Smart-Home-Systems im Modellhaus mit </w:t>
+            </w:r>
+            <w:r>
+              <w:t>FHEM</w:t>
+            </w:r>
+            <w:r>
+              <w:t>, Node-RED, MQTT, Docker und Arduino</w:t>
             </w:r>
           </w:p>
         </w:tc>
@@ -458,6 +441,38 @@
                 <w:szCs w:val="22"/>
               </w:rPr>
             </w:pPr>
+            <w:proofErr w:type="spellStart"/>
+            <w:r>
+              <w:t>Subthema</w:t>
+            </w:r>
+            <w:proofErr w:type="spellEnd"/>
+            <w:r>
+              <w:t>: Smart Assistant Steuerung des Smart Homes</w:t>
+            </w:r>
+            <w:r>
+              <w:t xml:space="preserve"> mit FHEM</w:t>
+            </w:r>
+            <w:r>
+              <w:t xml:space="preserve">; Verfasser: </w:t>
+            </w:r>
+            <w:r>
+              <w:t>Christian</w:t>
+            </w:r>
+            <w:r>
+              <w:t xml:space="preserve"> </w:t>
+            </w:r>
+            <w:r>
+              <w:t>Radlingmaier</w:t>
+            </w:r>
+            <w:r>
+              <w:t>; Klasse: 5</w:t>
+            </w:r>
+            <w:r>
+              <w:t>BHWIN</w:t>
+            </w:r>
+            <w:r>
+              <w:t>.</w:t>
+            </w:r>
           </w:p>
         </w:tc>
       </w:tr>
@@ -582,28 +597,7 @@
               </w:rPr>
             </w:pPr>
             <w:r>
-              <w:rPr>
-                <w:rFonts w:ascii="Arial" w:hAnsi="Arial" w:cs="Arial"/>
-                <w:sz w:val="22"/>
-                <w:szCs w:val="22"/>
-              </w:rPr>
-              <w:t>voest</w:t>
-            </w:r>
-            <w:r>
-              <w:rPr>
-                <w:rFonts w:ascii="Arial" w:hAnsi="Arial" w:cs="Arial"/>
-                <w:sz w:val="22"/>
-                <w:szCs w:val="22"/>
-              </w:rPr>
-              <w:t>alpine</w:t>
-            </w:r>
-            <w:r>
-              <w:rPr>
-                <w:rFonts w:ascii="Arial" w:hAnsi="Arial" w:cs="Arial"/>
-                <w:sz w:val="22"/>
-                <w:szCs w:val="22"/>
-              </w:rPr>
-              <w:t xml:space="preserve"> Schienen GmbH, Donawitz</w:t>
+              <w:t>HTL Leoben, Abteilung Informationstechnologie (schulinternes Projekt ohne externen Industriepartner).</w:t>
             </w:r>
           </w:p>
         </w:tc>
@@ -648,6 +642,25 @@
                 <w:szCs w:val="22"/>
               </w:rPr>
             </w:pPr>
+            <w:r>
+              <w:t xml:space="preserve">Dipl.-Wirt.-Ing. (FH) Christoph Leitner, </w:t>
+            </w:r>
+            <w:proofErr w:type="spellStart"/>
+            <w:r>
+              <w:t>BEd</w:t>
+            </w:r>
+            <w:proofErr w:type="spellEnd"/>
+            <w:r>
+              <w:t xml:space="preserve">; DI Dr. </w:t>
+            </w:r>
+            <w:proofErr w:type="spellStart"/>
+            <w:r>
+              <w:t>mont</w:t>
+            </w:r>
+            <w:proofErr w:type="spellEnd"/>
+            <w:r>
+              <w:t xml:space="preserve"> Thomas Messner.</w:t>
+            </w:r>
           </w:p>
         </w:tc>
       </w:tr>
@@ -709,7 +722,149 @@
                 <w:rFonts w:ascii="Arial" w:hAnsi="Arial" w:cs="Arial"/>
               </w:rPr>
             </w:pPr>
-          </w:p>
+            <w:r>
+              <w:t>Planung und Realisierung der zentralen Smart-Home-Steuerung auf Raspberry Pi; Aufbau der Containerdienste (</w:t>
+            </w:r>
+            <w:r>
+              <w:t>FHEM</w:t>
+            </w:r>
+            <w:r>
+              <w:t xml:space="preserve">, MQTT, </w:t>
+            </w:r>
+            <w:proofErr w:type="spellStart"/>
+            <w:r>
+              <w:t>Portainer</w:t>
+            </w:r>
+            <w:proofErr w:type="spellEnd"/>
+            <w:r>
+              <w:t>)</w:t>
+            </w:r>
+            <w:r>
+              <w:t xml:space="preserve">, sowie Dokumentation und Test der </w:t>
+            </w:r>
+            <w:proofErr w:type="spellStart"/>
+            <w:r>
+              <w:t>Automationsablaeufe</w:t>
+            </w:r>
+            <w:proofErr w:type="spellEnd"/>
+            <w:r>
+              <w:t>.</w:t>
+            </w:r>
+          </w:p>
+          <w:p>
+            <w:pPr>
+              <w:rPr>
+                <w:rFonts w:ascii="Arial" w:hAnsi="Arial" w:cs="Arial"/>
+              </w:rPr>
+            </w:pPr>
+          </w:p>
+          <w:p>
+            <w:pPr>
+              <w:rPr>
+                <w:rFonts w:ascii="Arial" w:hAnsi="Arial" w:cs="Arial"/>
+              </w:rPr>
+            </w:pPr>
+          </w:p>
+          <w:p>
+            <w:pPr>
+              <w:rPr>
+                <w:rFonts w:ascii="Arial" w:hAnsi="Arial" w:cs="Arial"/>
+              </w:rPr>
+            </w:pPr>
+          </w:p>
+        </w:tc>
+      </w:tr>
+    </w:tbl>
+    <w:p>
+      <w:pPr>
+        <w:rPr>
+          <w:rFonts w:ascii="Arial" w:hAnsi="Arial" w:cs="Arial"/>
+        </w:rPr>
+      </w:pPr>
+    </w:p>
+    <w:tbl>
+      <w:tblPr>
+        <w:tblStyle w:val="Tabellenraster"/>
+        <w:tblpPr w:leftFromText="141" w:rightFromText="141" w:vertAnchor="text" w:horzAnchor="margin" w:tblpX="108" w:tblpY="36"/>
+        <w:tblW w:w="16161" w:type="dxa"/>
+        <w:tblLayout w:type="fixed"/>
+        <w:tblLook w:val="00A0" w:firstRow="1" w:lastRow="0" w:firstColumn="1" w:lastColumn="0" w:noHBand="0" w:noVBand="0"/>
+      </w:tblPr>
+      <w:tblGrid>
+        <w:gridCol w:w="3119"/>
+        <w:gridCol w:w="6521"/>
+        <w:gridCol w:w="6521"/>
+      </w:tblGrid>
+      <w:tr>
+        <w:trPr>
+          <w:trHeight w:val="680"/>
+        </w:trPr>
+        <w:tc>
+          <w:tcPr>
+            <w:tcW w:w="3119" w:type="dxa"/>
+            <w:vAlign w:val="center"/>
+          </w:tcPr>
+          <w:p>
+            <w:pPr>
+              <w:rPr>
+                <w:rFonts w:ascii="Arial" w:hAnsi="Arial" w:cs="Arial"/>
+                <w:sz w:val="22"/>
+                <w:szCs w:val="22"/>
+              </w:rPr>
+            </w:pPr>
+            <w:r>
+              <w:rPr>
+                <w:rFonts w:ascii="Arial" w:hAnsi="Arial" w:cs="Arial"/>
+                <w:sz w:val="22"/>
+                <w:szCs w:val="22"/>
+              </w:rPr>
+              <w:t>(Geplante) Realisierung</w:t>
+            </w:r>
+          </w:p>
+        </w:tc>
+        <w:tc>
+          <w:tcPr>
+            <w:tcW w:w="6521" w:type="dxa"/>
+            <w:vAlign w:val="center"/>
+          </w:tcPr>
+          <w:p>
+            <w:pPr>
+              <w:rPr>
+                <w:rFonts w:ascii="Arial" w:hAnsi="Arial" w:cs="Arial"/>
+              </w:rPr>
+            </w:pPr>
+            <w:r>
+              <w:t xml:space="preserve">Schrittweiser Aufbau mit Docker </w:t>
+            </w:r>
+            <w:proofErr w:type="spellStart"/>
+            <w:r>
+              <w:t>Compose</w:t>
+            </w:r>
+            <w:proofErr w:type="spellEnd"/>
+            <w:r>
+              <w:t xml:space="preserve"> auf dem Raspberry Pi, Definition einer dreistufigen Architektur (Feldebene, Verarbeitungsebene, Managementebene), Umsetzung von Licht- und </w:t>
+            </w:r>
+            <w:proofErr w:type="spellStart"/>
+            <w:r>
+              <w:t>Sensorautomationen</w:t>
+            </w:r>
+            <w:proofErr w:type="spellEnd"/>
+            <w:r>
+              <w:t xml:space="preserve">, Dashboard-Visualisierung in </w:t>
+            </w:r>
+            <w:r>
+              <w:t>FHEM</w:t>
+            </w:r>
+            <w:r>
+              <w:t xml:space="preserve"> und laufende Fehleranalyse (seriell/MQTT).</w:t>
+            </w:r>
+          </w:p>
+        </w:tc>
+        <w:tc>
+          <w:tcPr>
+            <w:tcW w:w="6521" w:type="dxa"/>
+            <w:vAlign w:val="center"/>
+          </w:tcPr>
           <w:p>
             <w:pPr>
               <w:rPr>
@@ -798,15 +953,7 @@
                 <w:sz w:val="22"/>
                 <w:szCs w:val="22"/>
               </w:rPr>
-              <w:t>Realisier</w:t>
-            </w:r>
-            <w:r>
-              <w:rPr>
-                <w:rFonts w:ascii="Arial" w:hAnsi="Arial" w:cs="Arial"/>
-                <w:sz w:val="22"/>
-                <w:szCs w:val="22"/>
-              </w:rPr>
-              <w:t>ung</w:t>
+              <w:t>Ergebnisse</w:t>
             </w:r>
           </w:p>
         </w:tc>
@@ -821,124 +968,20 @@
                 <w:rFonts w:ascii="Arial" w:hAnsi="Arial" w:cs="Arial"/>
               </w:rPr>
             </w:pPr>
-          </w:p>
-          <w:p>
-            <w:pPr>
-              <w:rPr>
-                <w:rFonts w:ascii="Arial" w:hAnsi="Arial" w:cs="Arial"/>
-              </w:rPr>
-            </w:pPr>
-          </w:p>
-          <w:p>
-            <w:pPr>
-              <w:rPr>
-                <w:rFonts w:ascii="Arial" w:hAnsi="Arial" w:cs="Arial"/>
-              </w:rPr>
-            </w:pPr>
-          </w:p>
-          <w:p>
-            <w:pPr>
-              <w:rPr>
-                <w:rFonts w:ascii="Arial" w:hAnsi="Arial" w:cs="Arial"/>
-              </w:rPr>
-            </w:pPr>
-          </w:p>
-          <w:p>
-            <w:pPr>
-              <w:rPr>
-                <w:rFonts w:ascii="Arial" w:hAnsi="Arial" w:cs="Arial"/>
-              </w:rPr>
-            </w:pPr>
-          </w:p>
-        </w:tc>
-      </w:tr>
-    </w:tbl>
-    <w:p>
-      <w:pPr>
-        <w:rPr>
-          <w:rFonts w:ascii="Arial" w:hAnsi="Arial" w:cs="Arial"/>
-        </w:rPr>
-      </w:pPr>
-    </w:p>
-    <w:tbl>
-      <w:tblPr>
-        <w:tblStyle w:val="Tabellenraster"/>
-        <w:tblpPr w:leftFromText="141" w:rightFromText="141" w:vertAnchor="text" w:horzAnchor="margin" w:tblpX="108" w:tblpY="36"/>
-        <w:tblW w:w="0" w:type="auto"/>
-        <w:tblLayout w:type="fixed"/>
-        <w:tblLook w:val="00A0" w:firstRow="1" w:lastRow="0" w:firstColumn="1" w:lastColumn="0" w:noHBand="0" w:noVBand="0"/>
-      </w:tblPr>
-      <w:tblGrid>
-        <w:gridCol w:w="3119"/>
-        <w:gridCol w:w="6521"/>
-      </w:tblGrid>
-      <w:tr>
-        <w:trPr>
-          <w:trHeight w:val="680"/>
-        </w:trPr>
-        <w:tc>
-          <w:tcPr>
-            <w:tcW w:w="3119" w:type="dxa"/>
-            <w:vAlign w:val="center"/>
-          </w:tcPr>
-          <w:p>
-            <w:pPr>
-              <w:rPr>
-                <w:rFonts w:ascii="Arial" w:hAnsi="Arial" w:cs="Arial"/>
-                <w:sz w:val="22"/>
-                <w:szCs w:val="22"/>
-              </w:rPr>
-            </w:pPr>
-            <w:r>
-              <w:rPr>
-                <w:rFonts w:ascii="Arial" w:hAnsi="Arial" w:cs="Arial"/>
-                <w:sz w:val="22"/>
-                <w:szCs w:val="22"/>
-              </w:rPr>
-              <w:t xml:space="preserve">(Geplante) </w:t>
-            </w:r>
-            <w:r>
-              <w:rPr>
-                <w:rFonts w:ascii="Arial" w:hAnsi="Arial" w:cs="Arial"/>
-                <w:sz w:val="22"/>
-                <w:szCs w:val="22"/>
-              </w:rPr>
-              <w:t>Ergebnisse</w:t>
-            </w:r>
-          </w:p>
-        </w:tc>
-        <w:tc>
-          <w:tcPr>
-            <w:tcW w:w="6521" w:type="dxa"/>
-            <w:vAlign w:val="center"/>
-          </w:tcPr>
-          <w:p>
-            <w:pPr>
-              <w:rPr>
-                <w:rFonts w:ascii="Arial" w:hAnsi="Arial" w:cs="Arial"/>
-              </w:rPr>
-            </w:pPr>
-          </w:p>
-          <w:p>
-            <w:pPr>
-              <w:rPr>
-                <w:rFonts w:ascii="Arial" w:hAnsi="Arial" w:cs="Arial"/>
-              </w:rPr>
-            </w:pPr>
-          </w:p>
-          <w:p>
-            <w:pPr>
-              <w:rPr>
-                <w:rFonts w:ascii="Arial" w:hAnsi="Arial" w:cs="Arial"/>
-              </w:rPr>
-            </w:pPr>
-          </w:p>
-          <w:p>
-            <w:pPr>
-              <w:rPr>
-                <w:rFonts w:ascii="Arial" w:hAnsi="Arial" w:cs="Arial"/>
-              </w:rPr>
-            </w:pPr>
+            <w:proofErr w:type="spellStart"/>
+            <w:r>
+              <w:t>Funktionsfaehiges</w:t>
+            </w:r>
+            <w:proofErr w:type="spellEnd"/>
+            <w:r>
+              <w:t xml:space="preserve">, modulares Smart-Home-Modell mit reproduzierbarer Inbetriebnahme; stabile Kommunikation zwischen Arduino, Node-RED, MQTT und </w:t>
+            </w:r>
+            <w:r>
+              <w:t>FHEM</w:t>
+            </w:r>
+            <w:r>
+              <w:t>; Sensordatenerfassung und manuelle Bedienung.</w:t>
+            </w:r>
           </w:p>
           <w:p>
             <w:pPr>
@@ -1098,13 +1141,14 @@
       <w:tblPr>
         <w:tblStyle w:val="Tabellenraster"/>
         <w:tblpPr w:leftFromText="141" w:rightFromText="141" w:vertAnchor="text" w:horzAnchor="margin" w:tblpX="108" w:tblpY="36"/>
-        <w:tblW w:w="0" w:type="auto"/>
+        <w:tblW w:w="16161" w:type="dxa"/>
         <w:tblLayout w:type="fixed"/>
         <w:tblLook w:val="00A0" w:firstRow="1" w:lastRow="0" w:firstColumn="1" w:lastColumn="0" w:noHBand="0" w:noVBand="0"/>
       </w:tblPr>
       <w:tblGrid>
         <w:gridCol w:w="3119"/>
         <w:gridCol w:w="6521"/>
+        <w:gridCol w:w="6521"/>
       </w:tblGrid>
       <w:tr>
         <w:trPr>
@@ -1147,6 +1191,22 @@
                 <w:szCs w:val="22"/>
               </w:rPr>
               <w:t>Auszeichnungen</w:t>
+            </w:r>
+          </w:p>
+        </w:tc>
+        <w:tc>
+          <w:tcPr>
+            <w:tcW w:w="6521" w:type="dxa"/>
+            <w:vAlign w:val="center"/>
+          </w:tcPr>
+          <w:p>
+            <w:pPr>
+              <w:rPr>
+                <w:rFonts w:ascii="Arial" w:hAnsi="Arial" w:cs="Arial"/>
+              </w:rPr>
+            </w:pPr>
+            <w:r>
+              <w:t>Derzeit keine Teilnahme an Wettbewerben oder Auszeichnungen geplant.</w:t>
             </w:r>
           </w:p>
         </w:tc>
@@ -1795,7 +1855,7 @@
 </file>
 
 <file path=word/endnotes.xml><?xml version="1.0" encoding="utf-8"?>
-<w:endnotes xmlns:wpc="http://schemas.microsoft.com/office/word/2010/wordprocessingCanvas" xmlns:cx="http://schemas.microsoft.com/office/drawing/2014/chartex" xmlns:cx1="http://schemas.microsoft.com/office/drawing/2015/9/8/chartex" xmlns:cx2="http://schemas.microsoft.com/office/drawing/2015/10/21/chartex" xmlns:cx3="http://schemas.microsoft.com/office/drawing/2016/5/9/chartex" xmlns:cx4="http://schemas.microsoft.com/office/drawing/2016/5/10/chartex" xmlns:cx5="http://schemas.microsoft.com/office/drawing/2016/5/11/chartex" xmlns:cx6="http://schemas.microsoft.com/office/drawing/2016/5/12/chartex" xmlns:cx7="http://schemas.microsoft.com/office/drawing/2016/5/13/chartex" xmlns:cx8="http://schemas.microsoft.com/office/drawing/2016/5/14/chartex" xmlns:mc="http://schemas.openxmlformats.org/markup-compatibility/2006" xmlns:aink="http://schemas.microsoft.com/office/drawing/2016/ink" xmlns:am3d="http://schemas.microsoft.com/office/drawing/2017/model3d" xmlns:o="urn:schemas-microsoft-com:office:office" xmlns:r="http://schemas.openxmlformats.org/officeDocument/2006/relationships" xmlns:m="http://schemas.openxmlformats.org/officeDocument/2006/math" xmlns:v="urn:schemas-microsoft-com:vml" xmlns:wp14="http://schemas.microsoft.com/office/word/2010/wordprocessingDrawing" xmlns:wp="http://schemas.openxmlformats.org/drawingml/2006/wordprocessingDrawing" xmlns:w10="urn:schemas-microsoft-com:office:word" xmlns:w="http://schemas.openxmlformats.org/wordprocessingml/2006/main" xmlns:w14="http://schemas.microsoft.com/office/word/2010/wordml" xmlns:w15="http://schemas.microsoft.com/office/word/2012/wordml" xmlns:w16cid="http://schemas.microsoft.com/office/word/2016/wordml/cid" xmlns:w16se="http://schemas.microsoft.com/office/word/2015/wordml/symex" xmlns:wpg="http://schemas.microsoft.com/office/word/2010/wordprocessingGroup" xmlns:wpi="http://schemas.microsoft.com/office/word/2010/wordprocessingInk" xmlns:wne="http://schemas.microsoft.com/office/word/2006/wordml" xmlns:wps="http://schemas.microsoft.com/office/word/2010/wordprocessingShape" mc:Ignorable="w14 w15 w16se w16cid wp14">
+<w:endnotes xmlns:wpc="http://schemas.microsoft.com/office/word/2010/wordprocessingCanvas" xmlns:cx="http://schemas.microsoft.com/office/drawing/2014/chartex" xmlns:cx1="http://schemas.microsoft.com/office/drawing/2015/9/8/chartex" xmlns:cx2="http://schemas.microsoft.com/office/drawing/2015/10/21/chartex" xmlns:cx3="http://schemas.microsoft.com/office/drawing/2016/5/9/chartex" xmlns:cx4="http://schemas.microsoft.com/office/drawing/2016/5/10/chartex" xmlns:cx5="http://schemas.microsoft.com/office/drawing/2016/5/11/chartex" xmlns:cx6="http://schemas.microsoft.com/office/drawing/2016/5/12/chartex" xmlns:cx7="http://schemas.microsoft.com/office/drawing/2016/5/13/chartex" xmlns:cx8="http://schemas.microsoft.com/office/drawing/2016/5/14/chartex" xmlns:mc="http://schemas.openxmlformats.org/markup-compatibility/2006" xmlns:aink="http://schemas.microsoft.com/office/drawing/2016/ink" xmlns:am3d="http://schemas.microsoft.com/office/drawing/2017/model3d" xmlns:o="urn:schemas-microsoft-com:office:office" xmlns:oel="http://schemas.microsoft.com/office/2019/extlst" xmlns:r="http://schemas.openxmlformats.org/officeDocument/2006/relationships" xmlns:m="http://schemas.openxmlformats.org/officeDocument/2006/math" xmlns:v="urn:schemas-microsoft-com:vml" xmlns:wp14="http://schemas.microsoft.com/office/word/2010/wordprocessingDrawing" xmlns:wp="http://schemas.openxmlformats.org/drawingml/2006/wordprocessingDrawing" xmlns:w10="urn:schemas-microsoft-com:office:word" xmlns:w="http://schemas.openxmlformats.org/wordprocessingml/2006/main" xmlns:w14="http://schemas.microsoft.com/office/word/2010/wordml" xmlns:w15="http://schemas.microsoft.com/office/word/2012/wordml" xmlns:w16cex="http://schemas.microsoft.com/office/word/2018/wordml/cex" xmlns:w16cid="http://schemas.microsoft.com/office/word/2016/wordml/cid" xmlns:w16="http://schemas.microsoft.com/office/word/2018/wordml" xmlns:w16du="http://schemas.microsoft.com/office/word/2023/wordml/word16du" xmlns:w16sdtdh="http://schemas.microsoft.com/office/word/2020/wordml/sdtdatahash" xmlns:w16sdtfl="http://schemas.microsoft.com/office/word/2024/wordml/sdtformatlock" xmlns:w16se="http://schemas.microsoft.com/office/word/2015/wordml/symex" xmlns:wpg="http://schemas.microsoft.com/office/word/2010/wordprocessingGroup" xmlns:wpi="http://schemas.microsoft.com/office/word/2010/wordprocessingInk" xmlns:wne="http://schemas.microsoft.com/office/word/2006/wordml" xmlns:wps="http://schemas.microsoft.com/office/word/2010/wordprocessingShape" mc:Ignorable="w14 w15 w16se w16cid w16 w16cex w16sdtdh w16sdtfl w16du wp14">
   <w:endnote w:type="separator" w:id="-1">
     <w:p>
       <w:r>
@@ -1814,7 +1874,7 @@
 </file>
 
 <file path=word/footer1.xml><?xml version="1.0" encoding="utf-8"?>
-<w:ftr xmlns:wpc="http://schemas.microsoft.com/office/word/2010/wordprocessingCanvas" xmlns:cx="http://schemas.microsoft.com/office/drawing/2014/chartex" xmlns:cx1="http://schemas.microsoft.com/office/drawing/2015/9/8/chartex" xmlns:cx2="http://schemas.microsoft.com/office/drawing/2015/10/21/chartex" xmlns:cx3="http://schemas.microsoft.com/office/drawing/2016/5/9/chartex" xmlns:cx4="http://schemas.microsoft.com/office/drawing/2016/5/10/chartex" xmlns:cx5="http://schemas.microsoft.com/office/drawing/2016/5/11/chartex" xmlns:cx6="http://schemas.microsoft.com/office/drawing/2016/5/12/chartex" xmlns:cx7="http://schemas.microsoft.com/office/drawing/2016/5/13/chartex" xmlns:cx8="http://schemas.microsoft.com/office/drawing/2016/5/14/chartex" xmlns:mc="http://schemas.openxmlformats.org/markup-compatibility/2006" xmlns:aink="http://schemas.microsoft.com/office/drawing/2016/ink" xmlns:am3d="http://schemas.microsoft.com/office/drawing/2017/model3d" xmlns:o="urn:schemas-microsoft-com:office:office" xmlns:r="http://schemas.openxmlformats.org/officeDocument/2006/relationships" xmlns:m="http://schemas.openxmlformats.org/officeDocument/2006/math" xmlns:v="urn:schemas-microsoft-com:vml" xmlns:wp14="http://schemas.microsoft.com/office/word/2010/wordprocessingDrawing" xmlns:wp="http://schemas.openxmlformats.org/drawingml/2006/wordprocessingDrawing" xmlns:w10="urn:schemas-microsoft-com:office:word" xmlns:w="http://schemas.openxmlformats.org/wordprocessingml/2006/main" xmlns:w14="http://schemas.microsoft.com/office/word/2010/wordml" xmlns:w15="http://schemas.microsoft.com/office/word/2012/wordml" xmlns:w16cid="http://schemas.microsoft.com/office/word/2016/wordml/cid" xmlns:w16se="http://schemas.microsoft.com/office/word/2015/wordml/symex" xmlns:wpg="http://schemas.microsoft.com/office/word/2010/wordprocessingGroup" xmlns:wpi="http://schemas.microsoft.com/office/word/2010/wordprocessingInk" xmlns:wne="http://schemas.microsoft.com/office/word/2006/wordml" xmlns:wps="http://schemas.microsoft.com/office/word/2010/wordprocessingShape" mc:Ignorable="w14 w15 w16se w16cid wp14">
+<w:ftr xmlns:wpc="http://schemas.microsoft.com/office/word/2010/wordprocessingCanvas" xmlns:cx="http://schemas.microsoft.com/office/drawing/2014/chartex" xmlns:cx1="http://schemas.microsoft.com/office/drawing/2015/9/8/chartex" xmlns:cx2="http://schemas.microsoft.com/office/drawing/2015/10/21/chartex" xmlns:cx3="http://schemas.microsoft.com/office/drawing/2016/5/9/chartex" xmlns:cx4="http://schemas.microsoft.com/office/drawing/2016/5/10/chartex" xmlns:cx5="http://schemas.microsoft.com/office/drawing/2016/5/11/chartex" xmlns:cx6="http://schemas.microsoft.com/office/drawing/2016/5/12/chartex" xmlns:cx7="http://schemas.microsoft.com/office/drawing/2016/5/13/chartex" xmlns:cx8="http://schemas.microsoft.com/office/drawing/2016/5/14/chartex" xmlns:mc="http://schemas.openxmlformats.org/markup-compatibility/2006" xmlns:aink="http://schemas.microsoft.com/office/drawing/2016/ink" xmlns:am3d="http://schemas.microsoft.com/office/drawing/2017/model3d" xmlns:o="urn:schemas-microsoft-com:office:office" xmlns:oel="http://schemas.microsoft.com/office/2019/extlst" xmlns:r="http://schemas.openxmlformats.org/officeDocument/2006/relationships" xmlns:m="http://schemas.openxmlformats.org/officeDocument/2006/math" xmlns:v="urn:schemas-microsoft-com:vml" xmlns:wp14="http://schemas.microsoft.com/office/word/2010/wordprocessingDrawing" xmlns:wp="http://schemas.openxmlformats.org/drawingml/2006/wordprocessingDrawing" xmlns:w10="urn:schemas-microsoft-com:office:word" xmlns:w="http://schemas.openxmlformats.org/wordprocessingml/2006/main" xmlns:w14="http://schemas.microsoft.com/office/word/2010/wordml" xmlns:w15="http://schemas.microsoft.com/office/word/2012/wordml" xmlns:w16cex="http://schemas.microsoft.com/office/word/2018/wordml/cex" xmlns:w16cid="http://schemas.microsoft.com/office/word/2016/wordml/cid" xmlns:w16="http://schemas.microsoft.com/office/word/2018/wordml" xmlns:w16du="http://schemas.microsoft.com/office/word/2023/wordml/word16du" xmlns:w16sdtdh="http://schemas.microsoft.com/office/word/2020/wordml/sdtdatahash" xmlns:w16sdtfl="http://schemas.microsoft.com/office/word/2024/wordml/sdtformatlock" xmlns:w16se="http://schemas.microsoft.com/office/word/2015/wordml/symex" xmlns:wpg="http://schemas.microsoft.com/office/word/2010/wordprocessingGroup" xmlns:wpi="http://schemas.microsoft.com/office/word/2010/wordprocessingInk" xmlns:wne="http://schemas.microsoft.com/office/word/2006/wordml" xmlns:wps="http://schemas.microsoft.com/office/word/2010/wordprocessingShape" mc:Ignorable="w14 w15 w16se w16cid w16 w16cex w16sdtdh w16sdtfl w16du wp14">
   <w:p>
     <w:pPr>
       <w:pStyle w:val="Fuzeile"/>
@@ -2066,7 +2126,7 @@
 </file>
 
 <file path=word/footnotes.xml><?xml version="1.0" encoding="utf-8"?>
-<w:footnotes xmlns:wpc="http://schemas.microsoft.com/office/word/2010/wordprocessingCanvas" xmlns:cx="http://schemas.microsoft.com/office/drawing/2014/chartex" xmlns:cx1="http://schemas.microsoft.com/office/drawing/2015/9/8/chartex" xmlns:cx2="http://schemas.microsoft.com/office/drawing/2015/10/21/chartex" xmlns:cx3="http://schemas.microsoft.com/office/drawing/2016/5/9/chartex" xmlns:cx4="http://schemas.microsoft.com/office/drawing/2016/5/10/chartex" xmlns:cx5="http://schemas.microsoft.com/office/drawing/2016/5/11/chartex" xmlns:cx6="http://schemas.microsoft.com/office/drawing/2016/5/12/chartex" xmlns:cx7="http://schemas.microsoft.com/office/drawing/2016/5/13/chartex" xmlns:cx8="http://schemas.microsoft.com/office/drawing/2016/5/14/chartex" xmlns:mc="http://schemas.openxmlformats.org/markup-compatibility/2006" xmlns:aink="http://schemas.microsoft.com/office/drawing/2016/ink" xmlns:am3d="http://schemas.microsoft.com/office/drawing/2017/model3d" xmlns:o="urn:schemas-microsoft-com:office:office" xmlns:r="http://schemas.openxmlformats.org/officeDocument/2006/relationships" xmlns:m="http://schemas.openxmlformats.org/officeDocument/2006/math" xmlns:v="urn:schemas-microsoft-com:vml" xmlns:wp14="http://schemas.microsoft.com/office/word/2010/wordprocessingDrawing" xmlns:wp="http://schemas.openxmlformats.org/drawingml/2006/wordprocessingDrawing" xmlns:w10="urn:schemas-microsoft-com:office:word" xmlns:w="http://schemas.openxmlformats.org/wordprocessingml/2006/main" xmlns:w14="http://schemas.microsoft.com/office/word/2010/wordml" xmlns:w15="http://schemas.microsoft.com/office/word/2012/wordml" xmlns:w16cid="http://schemas.microsoft.com/office/word/2016/wordml/cid" xmlns:w16se="http://schemas.microsoft.com/office/word/2015/wordml/symex" xmlns:wpg="http://schemas.microsoft.com/office/word/2010/wordprocessingGroup" xmlns:wpi="http://schemas.microsoft.com/office/word/2010/wordprocessingInk" xmlns:wne="http://schemas.microsoft.com/office/word/2006/wordml" xmlns:wps="http://schemas.microsoft.com/office/word/2010/wordprocessingShape" mc:Ignorable="w14 w15 w16se w16cid wp14">
+<w:footnotes xmlns:wpc="http://schemas.microsoft.com/office/word/2010/wordprocessingCanvas" xmlns:cx="http://schemas.microsoft.com/office/drawing/2014/chartex" xmlns:cx1="http://schemas.microsoft.com/office/drawing/2015/9/8/chartex" xmlns:cx2="http://schemas.microsoft.com/office/drawing/2015/10/21/chartex" xmlns:cx3="http://schemas.microsoft.com/office/drawing/2016/5/9/chartex" xmlns:cx4="http://schemas.microsoft.com/office/drawing/2016/5/10/chartex" xmlns:cx5="http://schemas.microsoft.com/office/drawing/2016/5/11/chartex" xmlns:cx6="http://schemas.microsoft.com/office/drawing/2016/5/12/chartex" xmlns:cx7="http://schemas.microsoft.com/office/drawing/2016/5/13/chartex" xmlns:cx8="http://schemas.microsoft.com/office/drawing/2016/5/14/chartex" xmlns:mc="http://schemas.openxmlformats.org/markup-compatibility/2006" xmlns:aink="http://schemas.microsoft.com/office/drawing/2016/ink" xmlns:am3d="http://schemas.microsoft.com/office/drawing/2017/model3d" xmlns:o="urn:schemas-microsoft-com:office:office" xmlns:oel="http://schemas.microsoft.com/office/2019/extlst" xmlns:r="http://schemas.openxmlformats.org/officeDocument/2006/relationships" xmlns:m="http://schemas.openxmlformats.org/officeDocument/2006/math" xmlns:v="urn:schemas-microsoft-com:vml" xmlns:wp14="http://schemas.microsoft.com/office/word/2010/wordprocessingDrawing" xmlns:wp="http://schemas.openxmlformats.org/drawingml/2006/wordprocessingDrawing" xmlns:w10="urn:schemas-microsoft-com:office:word" xmlns:w="http://schemas.openxmlformats.org/wordprocessingml/2006/main" xmlns:w14="http://schemas.microsoft.com/office/word/2010/wordml" xmlns:w15="http://schemas.microsoft.com/office/word/2012/wordml" xmlns:w16cex="http://schemas.microsoft.com/office/word/2018/wordml/cex" xmlns:w16cid="http://schemas.microsoft.com/office/word/2016/wordml/cid" xmlns:w16="http://schemas.microsoft.com/office/word/2018/wordml" xmlns:w16du="http://schemas.microsoft.com/office/word/2023/wordml/word16du" xmlns:w16sdtdh="http://schemas.microsoft.com/office/word/2020/wordml/sdtdatahash" xmlns:w16sdtfl="http://schemas.microsoft.com/office/word/2024/wordml/sdtformatlock" xmlns:w16se="http://schemas.microsoft.com/office/word/2015/wordml/symex" xmlns:wpg="http://schemas.microsoft.com/office/word/2010/wordprocessingGroup" xmlns:wpi="http://schemas.microsoft.com/office/word/2010/wordprocessingInk" xmlns:wne="http://schemas.microsoft.com/office/word/2006/wordml" xmlns:wps="http://schemas.microsoft.com/office/word/2010/wordprocessingShape" mc:Ignorable="w14 w15 w16se w16cid w16 w16cex w16sdtdh w16sdtfl w16du wp14">
   <w:footnote w:type="separator" w:id="-1">
     <w:p>
       <w:r>
@@ -2085,7 +2145,7 @@
 </file>
 
 <file path=word/header1.xml><?xml version="1.0" encoding="utf-8"?>
-<w:hdr xmlns:wpc="http://schemas.microsoft.com/office/word/2010/wordprocessingCanvas" xmlns:cx="http://schemas.microsoft.com/office/drawing/2014/chartex" xmlns:cx1="http://schemas.microsoft.com/office/drawing/2015/9/8/chartex" xmlns:cx2="http://schemas.microsoft.com/office/drawing/2015/10/21/chartex" xmlns:cx3="http://schemas.microsoft.com/office/drawing/2016/5/9/chartex" xmlns:cx4="http://schemas.microsoft.com/office/drawing/2016/5/10/chartex" xmlns:cx5="http://schemas.microsoft.com/office/drawing/2016/5/11/chartex" xmlns:cx6="http://schemas.microsoft.com/office/drawing/2016/5/12/chartex" xmlns:cx7="http://schemas.microsoft.com/office/drawing/2016/5/13/chartex" xmlns:cx8="http://schemas.microsoft.com/office/drawing/2016/5/14/chartex" xmlns:mc="http://schemas.openxmlformats.org/markup-compatibility/2006" xmlns:aink="http://schemas.microsoft.com/office/drawing/2016/ink" xmlns:am3d="http://schemas.microsoft.com/office/drawing/2017/model3d" xmlns:o="urn:schemas-microsoft-com:office:office" xmlns:r="http://schemas.openxmlformats.org/officeDocument/2006/relationships" xmlns:m="http://schemas.openxmlformats.org/officeDocument/2006/math" xmlns:v="urn:schemas-microsoft-com:vml" xmlns:wp14="http://schemas.microsoft.com/office/word/2010/wordprocessingDrawing" xmlns:wp="http://schemas.openxmlformats.org/drawingml/2006/wordprocessingDrawing" xmlns:w10="urn:schemas-microsoft-com:office:word" xmlns:w="http://schemas.openxmlformats.org/wordprocessingml/2006/main" xmlns:w14="http://schemas.microsoft.com/office/word/2010/wordml" xmlns:w15="http://schemas.microsoft.com/office/word/2012/wordml" xmlns:w16cid="http://schemas.microsoft.com/office/word/2016/wordml/cid" xmlns:w16se="http://schemas.microsoft.com/office/word/2015/wordml/symex" xmlns:wpg="http://schemas.microsoft.com/office/word/2010/wordprocessingGroup" xmlns:wpi="http://schemas.microsoft.com/office/word/2010/wordprocessingInk" xmlns:wne="http://schemas.microsoft.com/office/word/2006/wordml" xmlns:wps="http://schemas.microsoft.com/office/word/2010/wordprocessingShape" mc:Ignorable="w14 w15 w16se w16cid wp14">
+<w:hdr xmlns:wpc="http://schemas.microsoft.com/office/word/2010/wordprocessingCanvas" xmlns:cx="http://schemas.microsoft.com/office/drawing/2014/chartex" xmlns:cx1="http://schemas.microsoft.com/office/drawing/2015/9/8/chartex" xmlns:cx2="http://schemas.microsoft.com/office/drawing/2015/10/21/chartex" xmlns:cx3="http://schemas.microsoft.com/office/drawing/2016/5/9/chartex" xmlns:cx4="http://schemas.microsoft.com/office/drawing/2016/5/10/chartex" xmlns:cx5="http://schemas.microsoft.com/office/drawing/2016/5/11/chartex" xmlns:cx6="http://schemas.microsoft.com/office/drawing/2016/5/12/chartex" xmlns:cx7="http://schemas.microsoft.com/office/drawing/2016/5/13/chartex" xmlns:cx8="http://schemas.microsoft.com/office/drawing/2016/5/14/chartex" xmlns:mc="http://schemas.openxmlformats.org/markup-compatibility/2006" xmlns:aink="http://schemas.microsoft.com/office/drawing/2016/ink" xmlns:am3d="http://schemas.microsoft.com/office/drawing/2017/model3d" xmlns:o="urn:schemas-microsoft-com:office:office" xmlns:oel="http://schemas.microsoft.com/office/2019/extlst" xmlns:r="http://schemas.openxmlformats.org/officeDocument/2006/relationships" xmlns:m="http://schemas.openxmlformats.org/officeDocument/2006/math" xmlns:v="urn:schemas-microsoft-com:vml" xmlns:wp14="http://schemas.microsoft.com/office/word/2010/wordprocessingDrawing" xmlns:wp="http://schemas.openxmlformats.org/drawingml/2006/wordprocessingDrawing" xmlns:w10="urn:schemas-microsoft-com:office:word" xmlns:w="http://schemas.openxmlformats.org/wordprocessingml/2006/main" xmlns:w14="http://schemas.microsoft.com/office/word/2010/wordml" xmlns:w15="http://schemas.microsoft.com/office/word/2012/wordml" xmlns:w16cex="http://schemas.microsoft.com/office/word/2018/wordml/cex" xmlns:w16cid="http://schemas.microsoft.com/office/word/2016/wordml/cid" xmlns:w16="http://schemas.microsoft.com/office/word/2018/wordml" xmlns:w16du="http://schemas.microsoft.com/office/word/2023/wordml/word16du" xmlns:w16sdtdh="http://schemas.microsoft.com/office/word/2020/wordml/sdtdatahash" xmlns:w16sdtfl="http://schemas.microsoft.com/office/word/2024/wordml/sdtformatlock" xmlns:w16se="http://schemas.microsoft.com/office/word/2015/wordml/symex" xmlns:wpg="http://schemas.microsoft.com/office/word/2010/wordprocessingGroup" xmlns:wpi="http://schemas.microsoft.com/office/word/2010/wordprocessingInk" xmlns:wne="http://schemas.microsoft.com/office/word/2006/wordml" xmlns:wps="http://schemas.microsoft.com/office/word/2010/wordprocessingShape" mc:Ignorable="w14 w15 w16se w16cid w16 w16cex w16sdtdh w16sdtfl w16du wp14">
   <w:tbl>
     <w:tblPr>
       <w:tblW w:w="4950" w:type="pct"/>
@@ -2310,7 +2370,7 @@
 </file>
 
 <file path=word/styles.xml><?xml version="1.0" encoding="utf-8"?>
-<w:styles xmlns:mc="http://schemas.openxmlformats.org/markup-compatibility/2006" xmlns:r="http://schemas.openxmlformats.org/officeDocument/2006/relationships" xmlns:w="http://schemas.openxmlformats.org/wordprocessingml/2006/main" xmlns:w14="http://schemas.microsoft.com/office/word/2010/wordml" xmlns:w15="http://schemas.microsoft.com/office/word/2012/wordml" xmlns:w16cid="http://schemas.microsoft.com/office/word/2016/wordml/cid" xmlns:w16se="http://schemas.microsoft.com/office/word/2015/wordml/symex" mc:Ignorable="w14 w15 w16se w16cid">
+<w:styles xmlns:mc="http://schemas.openxmlformats.org/markup-compatibility/2006" xmlns:r="http://schemas.openxmlformats.org/officeDocument/2006/relationships" xmlns:w="http://schemas.openxmlformats.org/wordprocessingml/2006/main" xmlns:w14="http://schemas.microsoft.com/office/word/2010/wordml" xmlns:w15="http://schemas.microsoft.com/office/word/2012/wordml" xmlns:w16cex="http://schemas.microsoft.com/office/word/2018/wordml/cex" xmlns:w16cid="http://schemas.microsoft.com/office/word/2016/wordml/cid" xmlns:w16="http://schemas.microsoft.com/office/word/2018/wordml" xmlns:w16du="http://schemas.microsoft.com/office/word/2023/wordml/word16du" xmlns:w16sdtdh="http://schemas.microsoft.com/office/word/2020/wordml/sdtdatahash" xmlns:w16sdtfl="http://schemas.microsoft.com/office/word/2024/wordml/sdtformatlock" xmlns:w16se="http://schemas.microsoft.com/office/word/2015/wordml/symex" mc:Ignorable="w14 w15 w16se w16cid w16 w16cex w16sdtdh w16sdtfl w16du">
   <w:docDefaults>
     <w:rPrDefault>
       <w:rPr>
@@ -2320,7 +2380,7 @@
     </w:rPrDefault>
     <w:pPrDefault/>
   </w:docDefaults>
-  <w:latentStyles w:defLockedState="0" w:defUIPriority="99" w:defSemiHidden="0" w:defUnhideWhenUsed="0" w:defQFormat="0" w:count="375">
+  <w:latentStyles w:defLockedState="0" w:defUIPriority="99" w:defSemiHidden="0" w:defUnhideWhenUsed="0" w:defQFormat="0" w:count="376">
     <w:lsdException w:name="Normal" w:uiPriority="0" w:qFormat="1"/>
     <w:lsdException w:name="heading 1" w:uiPriority="9" w:qFormat="1"/>
     <w:lsdException w:name="heading 2" w:semiHidden="1" w:uiPriority="9" w:unhideWhenUsed="1" w:qFormat="1"/>
@@ -2696,6 +2756,7 @@
     <w:lsdException w:name="Smart Hyperlink" w:semiHidden="1" w:unhideWhenUsed="1"/>
     <w:lsdException w:name="Hashtag" w:semiHidden="1" w:unhideWhenUsed="1"/>
     <w:lsdException w:name="Unresolved Mention" w:semiHidden="1" w:unhideWhenUsed="1"/>
+    <w:lsdException w:name="Smart Link" w:semiHidden="1" w:unhideWhenUsed="1"/>
   </w:latentStyles>
   <w:style w:type="paragraph" w:default="1" w:styleId="Standard">
     <w:name w:val="Normal"/>

</xml_diff>

<commit_message>
Update thesis DOCX files (DE & EN)
Replace the German and English HTL diploma thesis .docx files with updated versions (content/formatting revisions for 2025). Binary document updates only; no source code changes.
</commit_message>
<xml_diff>
--- a/Diplomarbeit/doc/htl-da-doku-de-ab2025-it-christian-radlingmaier.docx
+++ b/Diplomarbeit/doc/htl-da-doku-de-ab2025-it-christian-radlingmaier.docx
@@ -400,25 +400,7 @@
                 <w:szCs w:val="22"/>
               </w:rPr>
               <w:br/>
-              <w:t>(</w:t>
-            </w:r>
-            <w:proofErr w:type="spellStart"/>
-            <w:r>
-              <w:rPr>
-                <w:rFonts w:ascii="Arial" w:hAnsi="Arial" w:cs="Arial"/>
-                <w:sz w:val="22"/>
-                <w:szCs w:val="22"/>
-              </w:rPr>
-              <w:t>Subthema</w:t>
-            </w:r>
-            <w:proofErr w:type="spellEnd"/>
-            <w:r>
-              <w:rPr>
-                <w:rFonts w:ascii="Arial" w:hAnsi="Arial" w:cs="Arial"/>
-                <w:sz w:val="22"/>
-                <w:szCs w:val="22"/>
-              </w:rPr>
-              <w:t>, Verfasser/in, Klasse)</w:t>
+              <w:t>(Subthema, Verfasser/in, Klasse)</w:t>
             </w:r>
           </w:p>
         </w:tc>
@@ -435,13 +417,8 @@
                 <w:szCs w:val="22"/>
               </w:rPr>
             </w:pPr>
-            <w:proofErr w:type="spellStart"/>
-            <w:r>
-              <w:t>Subthema</w:t>
-            </w:r>
-            <w:proofErr w:type="spellEnd"/>
-            <w:r>
-              <w:t>: Smart Assistant Steuerung des Smart Homes mit FHEM; Verfasser: Christian Radlingmaier; Klasse: 5BHWIN.</w:t>
+            <w:r>
+              <w:t>Subthema: Smart Assistant Steuerung des Smart Homes mit FHEM; Verfasser: Christian Radlingmaier; Klasse: 5BHWIN.</w:t>
             </w:r>
           </w:p>
         </w:tc>
@@ -613,23 +590,7 @@
               </w:rPr>
             </w:pPr>
             <w:r>
-              <w:t xml:space="preserve">Dipl.-Wirt.-Ing. (FH) Christoph Leitner, </w:t>
-            </w:r>
-            <w:proofErr w:type="spellStart"/>
-            <w:r>
-              <w:t>BEd</w:t>
-            </w:r>
-            <w:proofErr w:type="spellEnd"/>
-            <w:r>
-              <w:t xml:space="preserve">; DI Dr. </w:t>
-            </w:r>
-            <w:proofErr w:type="spellStart"/>
-            <w:r>
-              <w:t>mont</w:t>
-            </w:r>
-            <w:proofErr w:type="spellEnd"/>
-            <w:r>
-              <w:t xml:space="preserve"> Thomas Messner.</w:t>
+              <w:t>Dipl.-Wirt.-Ing. (FH) Christoph Leitner, BEd; DI Dr. mont Thomas Messner.</w:t>
             </w:r>
           </w:p>
         </w:tc>
@@ -693,23 +654,7 @@
               </w:rPr>
             </w:pPr>
             <w:r>
-              <w:t xml:space="preserve">Planung und Realisierung der zentralen Smart-Home-Steuerung auf Raspberry Pi; Aufbau der Containerdienste (FHEM, MQTT, </w:t>
-            </w:r>
-            <w:proofErr w:type="spellStart"/>
-            <w:r>
-              <w:t>Portainer</w:t>
-            </w:r>
-            <w:proofErr w:type="spellEnd"/>
-            <w:r>
-              <w:t xml:space="preserve">), sowie Dokumentation und Test der </w:t>
-            </w:r>
-            <w:proofErr w:type="spellStart"/>
-            <w:r>
-              <w:t>Automationsablaeufe</w:t>
-            </w:r>
-            <w:proofErr w:type="spellEnd"/>
-            <w:r>
-              <w:t>.</w:t>
+              <w:t>Planung und Realisierung der zentralen Smart-Home-Steuerung auf Raspberry Pi; Aufbau der Containerdienste (FHEM, MQTT, Portainer), sowie Dokumentation und Test der Automationsablaeufe.</w:t>
             </w:r>
           </w:p>
           <w:p>
@@ -795,23 +740,7 @@
               </w:rPr>
             </w:pPr>
             <w:r>
-              <w:t xml:space="preserve">Schrittweiser Aufbau mit Docker </w:t>
-            </w:r>
-            <w:proofErr w:type="spellStart"/>
-            <w:r>
-              <w:t>Compose</w:t>
-            </w:r>
-            <w:proofErr w:type="spellEnd"/>
-            <w:r>
-              <w:t xml:space="preserve"> auf dem Raspberry Pi, Definition einer dreistufigen Architektur (Feldebene, Verarbeitungsebene, Managementebene), Umsetzung von Licht- und </w:t>
-            </w:r>
-            <w:proofErr w:type="spellStart"/>
-            <w:r>
-              <w:t>Sensorautomationen</w:t>
-            </w:r>
-            <w:proofErr w:type="spellEnd"/>
-            <w:r>
-              <w:t>, Dashboard-Visualisierung in FHEM und laufende Fehleranalyse (seriell/MQTT).</w:t>
+              <w:t>Schrittweiser Aufbau mit Docker Compose auf dem Raspberry Pi, Definition einer dreistufigen Architektur (Feldebene, Verarbeitungsebene, Managementebene), Umsetzung von Licht- und Sensorautomationen, Dashboard-Visualisierung in FHEM und laufende Fehleranalyse (seriell/MQTT).</w:t>
             </w:r>
           </w:p>
         </w:tc>
@@ -923,13 +852,8 @@
                 <w:rFonts w:ascii="Arial" w:hAnsi="Arial" w:cs="Arial"/>
               </w:rPr>
             </w:pPr>
-            <w:proofErr w:type="spellStart"/>
-            <w:r>
-              <w:t>Funktionsfaehiges</w:t>
-            </w:r>
-            <w:proofErr w:type="spellEnd"/>
-            <w:r>
-              <w:t>, modulares Smart-Home-Modell mit reproduzierbarer Inbetriebnahme; stabile Kommunikation zwischen Arduino, Node-RED, MQTT und FHEM; Sensordatenerfassung und manuelle Bedienung.</w:t>
+            <w:r>
+              <w:t>Funktionsfaehiges, modulares Smart-Home-Modell mit reproduzierbarer Inbetriebnahme; stabile Kommunikation zwischen Arduino, Node-RED, MQTT und FHEM; Sensordatenerfassung und manuelle Bedienung.</w:t>
             </w:r>
           </w:p>
           <w:p>
@@ -1052,6 +976,59 @@
                 <w:rFonts w:ascii="Arial" w:hAnsi="Arial" w:cs="Arial"/>
               </w:rPr>
             </w:pPr>
+            <w:r>
+              <w:rPr>
+                <w:noProof/>
+              </w:rPr>
+              <w:drawing>
+                <wp:inline distT="0" distB="0" distL="0" distR="0" wp14:anchorId="3C5CA4E4" wp14:editId="07D09314">
+                  <wp:extent cx="4003675" cy="4773930"/>
+                  <wp:effectExtent l="0" t="0" r="0" b="7620"/>
+                  <wp:docPr id="1734728525" name="Grafik 1"/>
+                  <wp:cNvGraphicFramePr>
+                    <a:graphicFrameLocks xmlns:a="http://schemas.openxmlformats.org/drawingml/2006/main" noChangeAspect="1"/>
+                  </wp:cNvGraphicFramePr>
+                  <a:graphic xmlns:a="http://schemas.openxmlformats.org/drawingml/2006/main">
+                    <a:graphicData uri="http://schemas.openxmlformats.org/drawingml/2006/picture">
+                      <pic:pic xmlns:pic="http://schemas.openxmlformats.org/drawingml/2006/picture">
+                        <pic:nvPicPr>
+                          <pic:cNvPr id="0" name="Picture 1"/>
+                          <pic:cNvPicPr>
+                            <a:picLocks noChangeAspect="1" noChangeArrowheads="1"/>
+                          </pic:cNvPicPr>
+                        </pic:nvPicPr>
+                        <pic:blipFill>
+                          <a:blip r:embed="rId6">
+                            <a:extLst>
+                              <a:ext uri="{28A0092B-C50C-407E-A947-70E740481C1C}">
+                                <a14:useLocalDpi xmlns:a14="http://schemas.microsoft.com/office/drawing/2010/main" val="0"/>
+                              </a:ext>
+                            </a:extLst>
+                          </a:blip>
+                          <a:srcRect/>
+                          <a:stretch>
+                            <a:fillRect/>
+                          </a:stretch>
+                        </pic:blipFill>
+                        <pic:spPr bwMode="auto">
+                          <a:xfrm>
+                            <a:off x="0" y="0"/>
+                            <a:ext cx="4003675" cy="4773930"/>
+                          </a:xfrm>
+                          <a:prstGeom prst="rect">
+                            <a:avLst/>
+                          </a:prstGeom>
+                          <a:noFill/>
+                          <a:ln>
+                            <a:noFill/>
+                          </a:ln>
+                        </pic:spPr>
+                      </pic:pic>
+                    </a:graphicData>
+                  </a:graphic>
+                </wp:inline>
+              </w:drawing>
+            </w:r>
           </w:p>
           <w:p>
             <w:pPr>
@@ -1234,23 +1211,7 @@
               </w:rPr>
             </w:pPr>
             <w:r>
-              <w:t xml:space="preserve">Einsicht </w:t>
-            </w:r>
-            <w:proofErr w:type="spellStart"/>
-            <w:r>
-              <w:t>ueber</w:t>
-            </w:r>
-            <w:proofErr w:type="spellEnd"/>
-            <w:r>
-              <w:t xml:space="preserve"> das Diplomarbeitsportal der HTL Leoben, interne Projektdokumentation (</w:t>
-            </w:r>
-            <w:proofErr w:type="spellStart"/>
-            <w:r>
-              <w:t>Git</w:t>
-            </w:r>
-            <w:proofErr w:type="spellEnd"/>
-            <w:r>
-              <w:t>-Repository) sowie gedruckte Fassung im Schularchiv.</w:t>
+              <w:t>Einsicht ueber das Diplomarbeitsportal der HTL Leoben, interne Projektdokumentation (Git-Repository) sowie gedruckte Fassung im Schularchiv.</w:t>
             </w:r>
           </w:p>
         </w:tc>
@@ -1811,8 +1772,8 @@
       </w:pPr>
     </w:p>
     <w:sectPr>
-      <w:headerReference w:type="default" r:id="rId6"/>
-      <w:footerReference w:type="default" r:id="rId7"/>
+      <w:headerReference w:type="default" r:id="rId7"/>
+      <w:footerReference w:type="default" r:id="rId8"/>
       <w:pgSz w:w="11906" w:h="16838"/>
       <w:pgMar w:top="1134" w:right="1134" w:bottom="1134" w:left="1134" w:header="709" w:footer="709" w:gutter="0"/>
       <w:cols w:space="708"/>
@@ -2281,19 +2242,8 @@
               <w:sz w:val="22"/>
               <w:szCs w:val="22"/>
             </w:rPr>
-            <w:t xml:space="preserve">Wirtschaftsingenieure – Informationstechnologie und smart </w:t>
+            <w:t>Wirtschaftsingenieure – Informationstechnologie und smart production</w:t>
           </w:r>
-          <w:proofErr w:type="spellStart"/>
-          <w:r>
-            <w:rPr>
-              <w:rFonts w:ascii="Arial" w:hAnsi="Arial" w:cs="Arial"/>
-              <w:b/>
-              <w:sz w:val="22"/>
-              <w:szCs w:val="22"/>
-            </w:rPr>
-            <w:t>production</w:t>
-          </w:r>
-          <w:proofErr w:type="spellEnd"/>
         </w:p>
       </w:tc>
       <w:tc>

</xml_diff>